<commit_message>
Final report check: fix reference publisher city, docx schema order, minor wording
- Mano & Ciletti 6th ed. publisher location corrected to New York, NY
- Code-listing paragraph border moved to schema-valid position (docx validates clean)
- Section credits in Table VII made non-overlapping; 'truth table' singular

Co-Authored-By: Claude Opus 5.5 <noreply@anthropic.com>
</commit_message>
<xml_diff>
--- a/DISL_OEP_Report_BCD_Excess3.docx
+++ b/DISL_OEP_Report_BCD_Excess3.docx
@@ -1413,7 +1413,7 @@
         <w:t xml:space="preserve">Documentation: </w:t>
       </w:r>
       <w:r>
-        <w:t>block diagram, truth tables, test-case table, waveform figure and this report.</w:t>
+        <w:t>block diagram, truth table, test-case table, waveform figure and this report.</w:t>
       </w:r>
     </w:p>
     <w:p>
@@ -2941,1000 +2941,1000 @@
     </w:p>
     <w:p>
       <w:pPr>
-        <w:spacing w:after="120" w:line="240" w:lineRule="auto"/>
-        <w:ind w:left="170" w:right="170"/>
-        <w:jc w:val="left"/>
         <w:pBdr>
           <w:top w:val="single" w:sz="4" w:space="4" w:color="A6A6A6"/>
           <w:left w:val="single" w:sz="4" w:space="4" w:color="A6A6A6"/>
           <w:bottom w:val="single" w:sz="4" w:space="4" w:color="A6A6A6"/>
           <w:right w:val="single" w:sz="4" w:space="4" w:color="A6A6A6"/>
         </w:pBdr>
-      </w:pPr>
-      <w:r>
-        <w:rPr>
-          <w:rFonts w:ascii="Consolas" w:hAnsi="Consolas"/>
-          <w:sz w:val="18"/>
-        </w:rPr>
-        <w:t>// 1-bit full adder (dataflow)</w:t>
-        <w:br/>
-      </w:r>
-      <w:r>
-        <w:rPr>
-          <w:rFonts w:ascii="Consolas" w:hAnsi="Consolas"/>
-          <w:sz w:val="18"/>
-        </w:rPr>
-        <w:t>module full_adder (</w:t>
-        <w:br/>
-      </w:r>
-      <w:r>
-        <w:rPr>
-          <w:rFonts w:ascii="Consolas" w:hAnsi="Consolas"/>
-          <w:sz w:val="18"/>
-        </w:rPr>
-        <w:t xml:space="preserve">    input  wire a,</w:t>
-        <w:br/>
-      </w:r>
-      <w:r>
-        <w:rPr>
-          <w:rFonts w:ascii="Consolas" w:hAnsi="Consolas"/>
-          <w:sz w:val="18"/>
-        </w:rPr>
-        <w:t xml:space="preserve">    input  wire b,</w:t>
-        <w:br/>
-      </w:r>
-      <w:r>
-        <w:rPr>
-          <w:rFonts w:ascii="Consolas" w:hAnsi="Consolas"/>
-          <w:sz w:val="18"/>
-        </w:rPr>
-        <w:t xml:space="preserve">    input  wire cin,</w:t>
-        <w:br/>
-      </w:r>
-      <w:r>
-        <w:rPr>
-          <w:rFonts w:ascii="Consolas" w:hAnsi="Consolas"/>
-          <w:sz w:val="18"/>
-        </w:rPr>
-        <w:t xml:space="preserve">    output wire s,</w:t>
-        <w:br/>
-      </w:r>
-      <w:r>
-        <w:rPr>
-          <w:rFonts w:ascii="Consolas" w:hAnsi="Consolas"/>
-          <w:sz w:val="18"/>
-        </w:rPr>
-        <w:t xml:space="preserve">    output wire cout</w:t>
-        <w:br/>
-      </w:r>
-      <w:r>
-        <w:rPr>
-          <w:rFonts w:ascii="Consolas" w:hAnsi="Consolas"/>
-          <w:sz w:val="18"/>
-        </w:rPr>
-        <w:t>);</w:t>
-        <w:br/>
-      </w:r>
-      <w:r>
-        <w:rPr>
-          <w:rFonts w:ascii="Consolas" w:hAnsi="Consolas"/>
-          <w:sz w:val="18"/>
-        </w:rPr>
-        <w:t xml:space="preserve">    assign s    = a ^ b ^ cin;</w:t>
-        <w:br/>
-      </w:r>
-      <w:r>
-        <w:rPr>
-          <w:rFonts w:ascii="Consolas" w:hAnsi="Consolas"/>
-          <w:sz w:val="18"/>
-        </w:rPr>
-        <w:t xml:space="preserve">    assign cout = (a &amp; b) | (cin &amp; (a ^ b));</w:t>
-        <w:br/>
-      </w:r>
-      <w:r>
-        <w:rPr>
-          <w:rFonts w:ascii="Consolas" w:hAnsi="Consolas"/>
-          <w:sz w:val="18"/>
-        </w:rPr>
-        <w:t>endmodule</w:t>
-        <w:br/>
-      </w:r>
-      <w:r>
-        <w:rPr>
-          <w:rFonts w:ascii="Consolas" w:hAnsi="Consolas"/>
-          <w:sz w:val="18"/>
-        </w:rPr>
-        <w:br/>
-      </w:r>
-      <w:r>
-        <w:rPr>
-          <w:rFonts w:ascii="Consolas" w:hAnsi="Consolas"/>
-          <w:sz w:val="18"/>
-        </w:rPr>
-        <w:t>// 4-bit ripple-carry adder built from four full adders</w:t>
-        <w:br/>
-      </w:r>
-      <w:r>
-        <w:rPr>
-          <w:rFonts w:ascii="Consolas" w:hAnsi="Consolas"/>
-          <w:sz w:val="18"/>
-        </w:rPr>
-        <w:t>module rca4 (</w:t>
-        <w:br/>
-      </w:r>
-      <w:r>
-        <w:rPr>
-          <w:rFonts w:ascii="Consolas" w:hAnsi="Consolas"/>
-          <w:sz w:val="18"/>
-        </w:rPr>
-        <w:t xml:space="preserve">    input  wire [3:0] a,</w:t>
-        <w:br/>
-      </w:r>
-      <w:r>
-        <w:rPr>
-          <w:rFonts w:ascii="Consolas" w:hAnsi="Consolas"/>
-          <w:sz w:val="18"/>
-        </w:rPr>
-        <w:t xml:space="preserve">    input  wire [3:0] b,</w:t>
-        <w:br/>
-      </w:r>
-      <w:r>
-        <w:rPr>
-          <w:rFonts w:ascii="Consolas" w:hAnsi="Consolas"/>
-          <w:sz w:val="18"/>
-        </w:rPr>
-        <w:t xml:space="preserve">    input  wire       cin,</w:t>
-        <w:br/>
-      </w:r>
-      <w:r>
-        <w:rPr>
-          <w:rFonts w:ascii="Consolas" w:hAnsi="Consolas"/>
-          <w:sz w:val="18"/>
-        </w:rPr>
-        <w:t xml:space="preserve">    output wire [3:0] s,</w:t>
-        <w:br/>
-      </w:r>
-      <w:r>
-        <w:rPr>
-          <w:rFonts w:ascii="Consolas" w:hAnsi="Consolas"/>
-          <w:sz w:val="18"/>
-        </w:rPr>
-        <w:t xml:space="preserve">    output wire       cout</w:t>
-        <w:br/>
-      </w:r>
-      <w:r>
-        <w:rPr>
-          <w:rFonts w:ascii="Consolas" w:hAnsi="Consolas"/>
-          <w:sz w:val="18"/>
-        </w:rPr>
-        <w:t>);</w:t>
-        <w:br/>
-      </w:r>
-      <w:r>
-        <w:rPr>
-          <w:rFonts w:ascii="Consolas" w:hAnsi="Consolas"/>
-          <w:sz w:val="18"/>
-        </w:rPr>
-        <w:t xml:space="preserve">    wire c1, c2, c3;</w:t>
-        <w:br/>
-      </w:r>
-      <w:r>
-        <w:rPr>
-          <w:rFonts w:ascii="Consolas" w:hAnsi="Consolas"/>
-          <w:sz w:val="18"/>
-        </w:rPr>
-        <w:t xml:space="preserve">    full_adder fa0 (.a(a[0]), .b(b[0]), .cin(cin), .s(s[0]), .cout(c1));</w:t>
-        <w:br/>
-      </w:r>
-      <w:r>
-        <w:rPr>
-          <w:rFonts w:ascii="Consolas" w:hAnsi="Consolas"/>
-          <w:sz w:val="18"/>
-        </w:rPr>
-        <w:t xml:space="preserve">    full_adder fa1 (.a(a[1]), .b(b[1]), .cin(c1),  .s(s[1]), .cout(c2));</w:t>
-        <w:br/>
-      </w:r>
-      <w:r>
-        <w:rPr>
-          <w:rFonts w:ascii="Consolas" w:hAnsi="Consolas"/>
-          <w:sz w:val="18"/>
-        </w:rPr>
-        <w:t xml:space="preserve">    full_adder fa2 (.a(a[2]), .b(b[2]), .cin(c2),  .s(s[2]), .cout(c3));</w:t>
-        <w:br/>
-      </w:r>
-      <w:r>
-        <w:rPr>
-          <w:rFonts w:ascii="Consolas" w:hAnsi="Consolas"/>
-          <w:sz w:val="18"/>
-        </w:rPr>
-        <w:t xml:space="preserve">    full_adder fa3 (.a(a[3]), .b(b[3]), .cin(c3),  .s(s[3]), .cout(cout));</w:t>
-        <w:br/>
-      </w:r>
-      <w:r>
-        <w:rPr>
-          <w:rFonts w:ascii="Consolas" w:hAnsi="Consolas"/>
-          <w:sz w:val="18"/>
-        </w:rPr>
-        <w:t>endmodule</w:t>
-      </w:r>
-    </w:p>
-    <w:p>
-      <w:pPr>
-        <w:spacing w:after="40"/>
-      </w:pPr>
-      <w:r>
-        <w:t>Listing 2: bcd_addsub (arithmetic core).</w:t>
-      </w:r>
-    </w:p>
-    <w:p>
-      <w:pPr>
         <w:spacing w:after="120" w:line="240" w:lineRule="auto"/>
         <w:ind w:left="170" w:right="170"/>
         <w:jc w:val="left"/>
+      </w:pPr>
+      <w:r>
+        <w:rPr>
+          <w:rFonts w:ascii="Consolas" w:hAnsi="Consolas"/>
+          <w:sz w:val="18"/>
+        </w:rPr>
+        <w:t>// 1-bit full adder (dataflow)</w:t>
+        <w:br/>
+      </w:r>
+      <w:r>
+        <w:rPr>
+          <w:rFonts w:ascii="Consolas" w:hAnsi="Consolas"/>
+          <w:sz w:val="18"/>
+        </w:rPr>
+        <w:t>module full_adder (</w:t>
+        <w:br/>
+      </w:r>
+      <w:r>
+        <w:rPr>
+          <w:rFonts w:ascii="Consolas" w:hAnsi="Consolas"/>
+          <w:sz w:val="18"/>
+        </w:rPr>
+        <w:t xml:space="preserve">    input  wire a,</w:t>
+        <w:br/>
+      </w:r>
+      <w:r>
+        <w:rPr>
+          <w:rFonts w:ascii="Consolas" w:hAnsi="Consolas"/>
+          <w:sz w:val="18"/>
+        </w:rPr>
+        <w:t xml:space="preserve">    input  wire b,</w:t>
+        <w:br/>
+      </w:r>
+      <w:r>
+        <w:rPr>
+          <w:rFonts w:ascii="Consolas" w:hAnsi="Consolas"/>
+          <w:sz w:val="18"/>
+        </w:rPr>
+        <w:t xml:space="preserve">    input  wire cin,</w:t>
+        <w:br/>
+      </w:r>
+      <w:r>
+        <w:rPr>
+          <w:rFonts w:ascii="Consolas" w:hAnsi="Consolas"/>
+          <w:sz w:val="18"/>
+        </w:rPr>
+        <w:t xml:space="preserve">    output wire s,</w:t>
+        <w:br/>
+      </w:r>
+      <w:r>
+        <w:rPr>
+          <w:rFonts w:ascii="Consolas" w:hAnsi="Consolas"/>
+          <w:sz w:val="18"/>
+        </w:rPr>
+        <w:t xml:space="preserve">    output wire cout</w:t>
+        <w:br/>
+      </w:r>
+      <w:r>
+        <w:rPr>
+          <w:rFonts w:ascii="Consolas" w:hAnsi="Consolas"/>
+          <w:sz w:val="18"/>
+        </w:rPr>
+        <w:t>);</w:t>
+        <w:br/>
+      </w:r>
+      <w:r>
+        <w:rPr>
+          <w:rFonts w:ascii="Consolas" w:hAnsi="Consolas"/>
+          <w:sz w:val="18"/>
+        </w:rPr>
+        <w:t xml:space="preserve">    assign s    = a ^ b ^ cin;</w:t>
+        <w:br/>
+      </w:r>
+      <w:r>
+        <w:rPr>
+          <w:rFonts w:ascii="Consolas" w:hAnsi="Consolas"/>
+          <w:sz w:val="18"/>
+        </w:rPr>
+        <w:t xml:space="preserve">    assign cout = (a &amp; b) | (cin &amp; (a ^ b));</w:t>
+        <w:br/>
+      </w:r>
+      <w:r>
+        <w:rPr>
+          <w:rFonts w:ascii="Consolas" w:hAnsi="Consolas"/>
+          <w:sz w:val="18"/>
+        </w:rPr>
+        <w:t>endmodule</w:t>
+        <w:br/>
+      </w:r>
+      <w:r>
+        <w:rPr>
+          <w:rFonts w:ascii="Consolas" w:hAnsi="Consolas"/>
+          <w:sz w:val="18"/>
+        </w:rPr>
+        <w:br/>
+      </w:r>
+      <w:r>
+        <w:rPr>
+          <w:rFonts w:ascii="Consolas" w:hAnsi="Consolas"/>
+          <w:sz w:val="18"/>
+        </w:rPr>
+        <w:t>// 4-bit ripple-carry adder built from four full adders</w:t>
+        <w:br/>
+      </w:r>
+      <w:r>
+        <w:rPr>
+          <w:rFonts w:ascii="Consolas" w:hAnsi="Consolas"/>
+          <w:sz w:val="18"/>
+        </w:rPr>
+        <w:t>module rca4 (</w:t>
+        <w:br/>
+      </w:r>
+      <w:r>
+        <w:rPr>
+          <w:rFonts w:ascii="Consolas" w:hAnsi="Consolas"/>
+          <w:sz w:val="18"/>
+        </w:rPr>
+        <w:t xml:space="preserve">    input  wire [3:0] a,</w:t>
+        <w:br/>
+      </w:r>
+      <w:r>
+        <w:rPr>
+          <w:rFonts w:ascii="Consolas" w:hAnsi="Consolas"/>
+          <w:sz w:val="18"/>
+        </w:rPr>
+        <w:t xml:space="preserve">    input  wire [3:0] b,</w:t>
+        <w:br/>
+      </w:r>
+      <w:r>
+        <w:rPr>
+          <w:rFonts w:ascii="Consolas" w:hAnsi="Consolas"/>
+          <w:sz w:val="18"/>
+        </w:rPr>
+        <w:t xml:space="preserve">    input  wire       cin,</w:t>
+        <w:br/>
+      </w:r>
+      <w:r>
+        <w:rPr>
+          <w:rFonts w:ascii="Consolas" w:hAnsi="Consolas"/>
+          <w:sz w:val="18"/>
+        </w:rPr>
+        <w:t xml:space="preserve">    output wire [3:0] s,</w:t>
+        <w:br/>
+      </w:r>
+      <w:r>
+        <w:rPr>
+          <w:rFonts w:ascii="Consolas" w:hAnsi="Consolas"/>
+          <w:sz w:val="18"/>
+        </w:rPr>
+        <w:t xml:space="preserve">    output wire       cout</w:t>
+        <w:br/>
+      </w:r>
+      <w:r>
+        <w:rPr>
+          <w:rFonts w:ascii="Consolas" w:hAnsi="Consolas"/>
+          <w:sz w:val="18"/>
+        </w:rPr>
+        <w:t>);</w:t>
+        <w:br/>
+      </w:r>
+      <w:r>
+        <w:rPr>
+          <w:rFonts w:ascii="Consolas" w:hAnsi="Consolas"/>
+          <w:sz w:val="18"/>
+        </w:rPr>
+        <w:t xml:space="preserve">    wire c1, c2, c3;</w:t>
+        <w:br/>
+      </w:r>
+      <w:r>
+        <w:rPr>
+          <w:rFonts w:ascii="Consolas" w:hAnsi="Consolas"/>
+          <w:sz w:val="18"/>
+        </w:rPr>
+        <w:t xml:space="preserve">    full_adder fa0 (.a(a[0]), .b(b[0]), .cin(cin), .s(s[0]), .cout(c1));</w:t>
+        <w:br/>
+      </w:r>
+      <w:r>
+        <w:rPr>
+          <w:rFonts w:ascii="Consolas" w:hAnsi="Consolas"/>
+          <w:sz w:val="18"/>
+        </w:rPr>
+        <w:t xml:space="preserve">    full_adder fa1 (.a(a[1]), .b(b[1]), .cin(c1),  .s(s[1]), .cout(c2));</w:t>
+        <w:br/>
+      </w:r>
+      <w:r>
+        <w:rPr>
+          <w:rFonts w:ascii="Consolas" w:hAnsi="Consolas"/>
+          <w:sz w:val="18"/>
+        </w:rPr>
+        <w:t xml:space="preserve">    full_adder fa2 (.a(a[2]), .b(b[2]), .cin(c2),  .s(s[2]), .cout(c3));</w:t>
+        <w:br/>
+      </w:r>
+      <w:r>
+        <w:rPr>
+          <w:rFonts w:ascii="Consolas" w:hAnsi="Consolas"/>
+          <w:sz w:val="18"/>
+        </w:rPr>
+        <w:t xml:space="preserve">    full_adder fa3 (.a(a[3]), .b(b[3]), .cin(c3),  .s(s[3]), .cout(cout));</w:t>
+        <w:br/>
+      </w:r>
+      <w:r>
+        <w:rPr>
+          <w:rFonts w:ascii="Consolas" w:hAnsi="Consolas"/>
+          <w:sz w:val="18"/>
+        </w:rPr>
+        <w:t>endmodule</w:t>
+      </w:r>
+    </w:p>
+    <w:p>
+      <w:pPr>
+        <w:spacing w:after="40"/>
+      </w:pPr>
+      <w:r>
+        <w:t>Listing 2: bcd_addsub (arithmetic core).</w:t>
+      </w:r>
+    </w:p>
+    <w:p>
+      <w:pPr>
         <w:pBdr>
           <w:top w:val="single" w:sz="4" w:space="4" w:color="A6A6A6"/>
           <w:left w:val="single" w:sz="4" w:space="4" w:color="A6A6A6"/>
           <w:bottom w:val="single" w:sz="4" w:space="4" w:color="A6A6A6"/>
           <w:right w:val="single" w:sz="4" w:space="4" w:color="A6A6A6"/>
         </w:pBdr>
-      </w:pPr>
-      <w:r>
-        <w:rPr>
-          <w:rFonts w:ascii="Consolas" w:hAnsi="Consolas"/>
-          <w:sz w:val="18"/>
-        </w:rPr>
-        <w:t>// Single-digit BCD adder/subtractor</w:t>
-        <w:br/>
-      </w:r>
-      <w:r>
-        <w:rPr>
-          <w:rFonts w:ascii="Consolas" w:hAnsi="Consolas"/>
-          <w:sz w:val="18"/>
-        </w:rPr>
-        <w:t>//   m = 0 : A + B  -&gt; {tens, units} (0..18), sign = 0</w:t>
-        <w:br/>
-      </w:r>
-      <w:r>
-        <w:rPr>
-          <w:rFonts w:ascii="Consolas" w:hAnsi="Consolas"/>
-          <w:sz w:val="18"/>
-        </w:rPr>
-        <w:t>//   m = 1 : A - B  -&gt; sign-magnitude result, magnitude in units (0..9)</w:t>
-        <w:br/>
-      </w:r>
-      <w:r>
-        <w:rPr>
-          <w:rFonts w:ascii="Consolas" w:hAnsi="Consolas"/>
-          <w:sz w:val="18"/>
-        </w:rPr>
-        <w:t>module bcd_addsub (</w:t>
-        <w:br/>
-      </w:r>
-      <w:r>
-        <w:rPr>
-          <w:rFonts w:ascii="Consolas" w:hAnsi="Consolas"/>
-          <w:sz w:val="18"/>
-        </w:rPr>
-        <w:t xml:space="preserve">    input  wire [3:0] a,</w:t>
-        <w:br/>
-      </w:r>
-      <w:r>
-        <w:rPr>
-          <w:rFonts w:ascii="Consolas" w:hAnsi="Consolas"/>
-          <w:sz w:val="18"/>
-        </w:rPr>
-        <w:t xml:space="preserve">    input  wire [3:0] b,</w:t>
-        <w:br/>
-      </w:r>
-      <w:r>
-        <w:rPr>
-          <w:rFonts w:ascii="Consolas" w:hAnsi="Consolas"/>
-          <w:sz w:val="18"/>
-        </w:rPr>
-        <w:t xml:space="preserve">    input  wire       m,        // 0 = add, 1 = subtract</w:t>
-        <w:br/>
-      </w:r>
-      <w:r>
-        <w:rPr>
-          <w:rFonts w:ascii="Consolas" w:hAnsi="Consolas"/>
-          <w:sz w:val="18"/>
-        </w:rPr>
-        <w:t xml:space="preserve">    output wire [3:0] units,</w:t>
-        <w:br/>
-      </w:r>
-      <w:r>
-        <w:rPr>
-          <w:rFonts w:ascii="Consolas" w:hAnsi="Consolas"/>
-          <w:sz w:val="18"/>
-        </w:rPr>
-        <w:t xml:space="preserve">    output wire       tens,     // decimal carry (tens digit, 0 or 1)</w:t>
-        <w:br/>
-      </w:r>
-      <w:r>
-        <w:rPr>
-          <w:rFonts w:ascii="Consolas" w:hAnsi="Consolas"/>
-          <w:sz w:val="18"/>
-        </w:rPr>
-        <w:t xml:space="preserve">    output wire       sign      // 1 = negative difference</w:t>
-        <w:br/>
-      </w:r>
-      <w:r>
-        <w:rPr>
-          <w:rFonts w:ascii="Consolas" w:hAnsi="Consolas"/>
-          <w:sz w:val="18"/>
-        </w:rPr>
-        <w:t>);</w:t>
-        <w:br/>
-      </w:r>
-      <w:r>
-        <w:rPr>
-          <w:rFonts w:ascii="Consolas" w:hAnsi="Consolas"/>
-          <w:sz w:val="18"/>
-        </w:rPr>
-        <w:t xml:space="preserve">    // Stage 1: binary adder/subtractor (two's complement when m = 1)</w:t>
-        <w:br/>
-      </w:r>
-      <w:r>
-        <w:rPr>
-          <w:rFonts w:ascii="Consolas" w:hAnsi="Consolas"/>
-          <w:sz w:val="18"/>
-        </w:rPr>
-        <w:t xml:space="preserve">    wire [3:0] b_x = b ^ {4{m}};</w:t>
-        <w:br/>
-      </w:r>
-      <w:r>
-        <w:rPr>
-          <w:rFonts w:ascii="Consolas" w:hAnsi="Consolas"/>
-          <w:sz w:val="18"/>
-        </w:rPr>
-        <w:t xml:space="preserve">    wire [3:0] s1;</w:t>
-        <w:br/>
-      </w:r>
-      <w:r>
-        <w:rPr>
-          <w:rFonts w:ascii="Consolas" w:hAnsi="Consolas"/>
-          <w:sz w:val="18"/>
-        </w:rPr>
-        <w:t xml:space="preserve">    wire       c1;</w:t>
-        <w:br/>
-      </w:r>
-      <w:r>
-        <w:rPr>
-          <w:rFonts w:ascii="Consolas" w:hAnsi="Consolas"/>
-          <w:sz w:val="18"/>
-        </w:rPr>
-        <w:t xml:space="preserve">    rca4 stage1 (.a(a), .b(b_x), .cin(m), .s(s1), .cout(c1));</w:t>
-        <w:br/>
-      </w:r>
-      <w:r>
-        <w:rPr>
-          <w:rFonts w:ascii="Consolas" w:hAnsi="Consolas"/>
-          <w:sz w:val="18"/>
-        </w:rPr>
-        <w:br/>
-      </w:r>
-      <w:r>
-        <w:rPr>
-          <w:rFonts w:ascii="Consolas" w:hAnsi="Consolas"/>
-          <w:sz w:val="18"/>
-        </w:rPr>
-        <w:t xml:space="preserve">    // Decimal correction condition for addition: sum &gt; 9</w:t>
-        <w:br/>
-      </w:r>
-      <w:r>
-        <w:rPr>
-          <w:rFonts w:ascii="Consolas" w:hAnsi="Consolas"/>
-          <w:sz w:val="18"/>
-        </w:rPr>
-        <w:t xml:space="preserve">    wire k   = c1 | (s1[3] &amp; s1[2]) | (s1[3] &amp; s1[1]);</w:t>
-        <w:br/>
-      </w:r>
-      <w:r>
-        <w:rPr>
-          <w:rFonts w:ascii="Consolas" w:hAnsi="Consolas"/>
-          <w:sz w:val="18"/>
-        </w:rPr>
-        <w:t xml:space="preserve">    wire add_fix = ~m &amp; k;</w:t>
-        <w:br/>
-      </w:r>
-      <w:r>
-        <w:rPr>
-          <w:rFonts w:ascii="Consolas" w:hAnsi="Consolas"/>
-          <w:sz w:val="18"/>
-        </w:rPr>
-        <w:t xml:space="preserve">    // Negative difference: no end-around carry out of stage 1</w:t>
-        <w:br/>
-      </w:r>
-      <w:r>
-        <w:rPr>
-          <w:rFonts w:ascii="Consolas" w:hAnsi="Consolas"/>
-          <w:sz w:val="18"/>
-        </w:rPr>
-        <w:t xml:space="preserve">    wire neg = m &amp; ~c1;</w:t>
-        <w:br/>
-      </w:r>
-      <w:r>
-        <w:rPr>
-          <w:rFonts w:ascii="Consolas" w:hAnsi="Consolas"/>
-          <w:sz w:val="18"/>
-        </w:rPr>
-        <w:br/>
-      </w:r>
-      <w:r>
-        <w:rPr>
-          <w:rFonts w:ascii="Consolas" w:hAnsi="Consolas"/>
-          <w:sz w:val="18"/>
-        </w:rPr>
-        <w:t xml:space="preserve">    // Stage 2: +0110 correction (add) or two's-complement recovery (negative sub)</w:t>
-        <w:br/>
-      </w:r>
-      <w:r>
-        <w:rPr>
-          <w:rFonts w:ascii="Consolas" w:hAnsi="Consolas"/>
-          <w:sz w:val="18"/>
-        </w:rPr>
-        <w:t xml:space="preserve">    wire [3:0] x2 = s1 ^ {4{neg}};</w:t>
-        <w:br/>
-      </w:r>
-      <w:r>
-        <w:rPr>
-          <w:rFonts w:ascii="Consolas" w:hAnsi="Consolas"/>
-          <w:sz w:val="18"/>
-        </w:rPr>
-        <w:t xml:space="preserve">    wire [3:0] y2 = {1'b0, add_fix, add_fix, 1'b0};</w:t>
-        <w:br/>
-      </w:r>
-      <w:r>
-        <w:rPr>
-          <w:rFonts w:ascii="Consolas" w:hAnsi="Consolas"/>
-          <w:sz w:val="18"/>
-        </w:rPr>
-        <w:t xml:space="preserve">    wire       c2_unused;</w:t>
-        <w:br/>
-      </w:r>
-      <w:r>
-        <w:rPr>
-          <w:rFonts w:ascii="Consolas" w:hAnsi="Consolas"/>
-          <w:sz w:val="18"/>
-        </w:rPr>
-        <w:t xml:space="preserve">    rca4 stage2 (.a(x2), .b(y2), .cin(neg), .s(units), .cout(c2_unused));</w:t>
-        <w:br/>
-      </w:r>
-      <w:r>
-        <w:rPr>
-          <w:rFonts w:ascii="Consolas" w:hAnsi="Consolas"/>
-          <w:sz w:val="18"/>
-        </w:rPr>
-        <w:br/>
-      </w:r>
-      <w:r>
-        <w:rPr>
-          <w:rFonts w:ascii="Consolas" w:hAnsi="Consolas"/>
-          <w:sz w:val="18"/>
-        </w:rPr>
-        <w:t xml:space="preserve">    assign tens = add_fix;</w:t>
-        <w:br/>
-      </w:r>
-      <w:r>
-        <w:rPr>
-          <w:rFonts w:ascii="Consolas" w:hAnsi="Consolas"/>
-          <w:sz w:val="18"/>
-        </w:rPr>
-        <w:t xml:space="preserve">    assign sign = neg;</w:t>
-        <w:br/>
-      </w:r>
-      <w:r>
-        <w:rPr>
-          <w:rFonts w:ascii="Consolas" w:hAnsi="Consolas"/>
-          <w:sz w:val="18"/>
-        </w:rPr>
-        <w:t>endmodule</w:t>
-      </w:r>
-    </w:p>
-    <w:p>
-      <w:pPr>
-        <w:spacing w:after="40"/>
-      </w:pPr>
-      <w:r>
-        <w:t>Listing 3: bcd_to_xs3 and top module bcd_alu_xs3.</w:t>
-      </w:r>
-    </w:p>
-    <w:p>
-      <w:pPr>
         <w:spacing w:after="120" w:line="240" w:lineRule="auto"/>
         <w:ind w:left="170" w:right="170"/>
         <w:jc w:val="left"/>
+      </w:pPr>
+      <w:r>
+        <w:rPr>
+          <w:rFonts w:ascii="Consolas" w:hAnsi="Consolas"/>
+          <w:sz w:val="18"/>
+        </w:rPr>
+        <w:t>// Single-digit BCD adder/subtractor</w:t>
+        <w:br/>
+      </w:r>
+      <w:r>
+        <w:rPr>
+          <w:rFonts w:ascii="Consolas" w:hAnsi="Consolas"/>
+          <w:sz w:val="18"/>
+        </w:rPr>
+        <w:t>//   m = 0 : A + B  -&gt; {tens, units} (0..18), sign = 0</w:t>
+        <w:br/>
+      </w:r>
+      <w:r>
+        <w:rPr>
+          <w:rFonts w:ascii="Consolas" w:hAnsi="Consolas"/>
+          <w:sz w:val="18"/>
+        </w:rPr>
+        <w:t>//   m = 1 : A - B  -&gt; sign-magnitude result, magnitude in units (0..9)</w:t>
+        <w:br/>
+      </w:r>
+      <w:r>
+        <w:rPr>
+          <w:rFonts w:ascii="Consolas" w:hAnsi="Consolas"/>
+          <w:sz w:val="18"/>
+        </w:rPr>
+        <w:t>module bcd_addsub (</w:t>
+        <w:br/>
+      </w:r>
+      <w:r>
+        <w:rPr>
+          <w:rFonts w:ascii="Consolas" w:hAnsi="Consolas"/>
+          <w:sz w:val="18"/>
+        </w:rPr>
+        <w:t xml:space="preserve">    input  wire [3:0] a,</w:t>
+        <w:br/>
+      </w:r>
+      <w:r>
+        <w:rPr>
+          <w:rFonts w:ascii="Consolas" w:hAnsi="Consolas"/>
+          <w:sz w:val="18"/>
+        </w:rPr>
+        <w:t xml:space="preserve">    input  wire [3:0] b,</w:t>
+        <w:br/>
+      </w:r>
+      <w:r>
+        <w:rPr>
+          <w:rFonts w:ascii="Consolas" w:hAnsi="Consolas"/>
+          <w:sz w:val="18"/>
+        </w:rPr>
+        <w:t xml:space="preserve">    input  wire       m,        // 0 = add, 1 = subtract</w:t>
+        <w:br/>
+      </w:r>
+      <w:r>
+        <w:rPr>
+          <w:rFonts w:ascii="Consolas" w:hAnsi="Consolas"/>
+          <w:sz w:val="18"/>
+        </w:rPr>
+        <w:t xml:space="preserve">    output wire [3:0] units,</w:t>
+        <w:br/>
+      </w:r>
+      <w:r>
+        <w:rPr>
+          <w:rFonts w:ascii="Consolas" w:hAnsi="Consolas"/>
+          <w:sz w:val="18"/>
+        </w:rPr>
+        <w:t xml:space="preserve">    output wire       tens,     // decimal carry (tens digit, 0 or 1)</w:t>
+        <w:br/>
+      </w:r>
+      <w:r>
+        <w:rPr>
+          <w:rFonts w:ascii="Consolas" w:hAnsi="Consolas"/>
+          <w:sz w:val="18"/>
+        </w:rPr>
+        <w:t xml:space="preserve">    output wire       sign      // 1 = negative difference</w:t>
+        <w:br/>
+      </w:r>
+      <w:r>
+        <w:rPr>
+          <w:rFonts w:ascii="Consolas" w:hAnsi="Consolas"/>
+          <w:sz w:val="18"/>
+        </w:rPr>
+        <w:t>);</w:t>
+        <w:br/>
+      </w:r>
+      <w:r>
+        <w:rPr>
+          <w:rFonts w:ascii="Consolas" w:hAnsi="Consolas"/>
+          <w:sz w:val="18"/>
+        </w:rPr>
+        <w:t xml:space="preserve">    // Stage 1: binary adder/subtractor (two's complement when m = 1)</w:t>
+        <w:br/>
+      </w:r>
+      <w:r>
+        <w:rPr>
+          <w:rFonts w:ascii="Consolas" w:hAnsi="Consolas"/>
+          <w:sz w:val="18"/>
+        </w:rPr>
+        <w:t xml:space="preserve">    wire [3:0] b_x = b ^ {4{m}};</w:t>
+        <w:br/>
+      </w:r>
+      <w:r>
+        <w:rPr>
+          <w:rFonts w:ascii="Consolas" w:hAnsi="Consolas"/>
+          <w:sz w:val="18"/>
+        </w:rPr>
+        <w:t xml:space="preserve">    wire [3:0] s1;</w:t>
+        <w:br/>
+      </w:r>
+      <w:r>
+        <w:rPr>
+          <w:rFonts w:ascii="Consolas" w:hAnsi="Consolas"/>
+          <w:sz w:val="18"/>
+        </w:rPr>
+        <w:t xml:space="preserve">    wire       c1;</w:t>
+        <w:br/>
+      </w:r>
+      <w:r>
+        <w:rPr>
+          <w:rFonts w:ascii="Consolas" w:hAnsi="Consolas"/>
+          <w:sz w:val="18"/>
+        </w:rPr>
+        <w:t xml:space="preserve">    rca4 stage1 (.a(a), .b(b_x), .cin(m), .s(s1), .cout(c1));</w:t>
+        <w:br/>
+      </w:r>
+      <w:r>
+        <w:rPr>
+          <w:rFonts w:ascii="Consolas" w:hAnsi="Consolas"/>
+          <w:sz w:val="18"/>
+        </w:rPr>
+        <w:br/>
+      </w:r>
+      <w:r>
+        <w:rPr>
+          <w:rFonts w:ascii="Consolas" w:hAnsi="Consolas"/>
+          <w:sz w:val="18"/>
+        </w:rPr>
+        <w:t xml:space="preserve">    // Decimal correction condition for addition: sum &gt; 9</w:t>
+        <w:br/>
+      </w:r>
+      <w:r>
+        <w:rPr>
+          <w:rFonts w:ascii="Consolas" w:hAnsi="Consolas"/>
+          <w:sz w:val="18"/>
+        </w:rPr>
+        <w:t xml:space="preserve">    wire k   = c1 | (s1[3] &amp; s1[2]) | (s1[3] &amp; s1[1]);</w:t>
+        <w:br/>
+      </w:r>
+      <w:r>
+        <w:rPr>
+          <w:rFonts w:ascii="Consolas" w:hAnsi="Consolas"/>
+          <w:sz w:val="18"/>
+        </w:rPr>
+        <w:t xml:space="preserve">    wire add_fix = ~m &amp; k;</w:t>
+        <w:br/>
+      </w:r>
+      <w:r>
+        <w:rPr>
+          <w:rFonts w:ascii="Consolas" w:hAnsi="Consolas"/>
+          <w:sz w:val="18"/>
+        </w:rPr>
+        <w:t xml:space="preserve">    // Negative difference: no end-around carry out of stage 1</w:t>
+        <w:br/>
+      </w:r>
+      <w:r>
+        <w:rPr>
+          <w:rFonts w:ascii="Consolas" w:hAnsi="Consolas"/>
+          <w:sz w:val="18"/>
+        </w:rPr>
+        <w:t xml:space="preserve">    wire neg = m &amp; ~c1;</w:t>
+        <w:br/>
+      </w:r>
+      <w:r>
+        <w:rPr>
+          <w:rFonts w:ascii="Consolas" w:hAnsi="Consolas"/>
+          <w:sz w:val="18"/>
+        </w:rPr>
+        <w:br/>
+      </w:r>
+      <w:r>
+        <w:rPr>
+          <w:rFonts w:ascii="Consolas" w:hAnsi="Consolas"/>
+          <w:sz w:val="18"/>
+        </w:rPr>
+        <w:t xml:space="preserve">    // Stage 2: +0110 correction (add) or two's-complement recovery (negative sub)</w:t>
+        <w:br/>
+      </w:r>
+      <w:r>
+        <w:rPr>
+          <w:rFonts w:ascii="Consolas" w:hAnsi="Consolas"/>
+          <w:sz w:val="18"/>
+        </w:rPr>
+        <w:t xml:space="preserve">    wire [3:0] x2 = s1 ^ {4{neg}};</w:t>
+        <w:br/>
+      </w:r>
+      <w:r>
+        <w:rPr>
+          <w:rFonts w:ascii="Consolas" w:hAnsi="Consolas"/>
+          <w:sz w:val="18"/>
+        </w:rPr>
+        <w:t xml:space="preserve">    wire [3:0] y2 = {1'b0, add_fix, add_fix, 1'b0};</w:t>
+        <w:br/>
+      </w:r>
+      <w:r>
+        <w:rPr>
+          <w:rFonts w:ascii="Consolas" w:hAnsi="Consolas"/>
+          <w:sz w:val="18"/>
+        </w:rPr>
+        <w:t xml:space="preserve">    wire       c2_unused;</w:t>
+        <w:br/>
+      </w:r>
+      <w:r>
+        <w:rPr>
+          <w:rFonts w:ascii="Consolas" w:hAnsi="Consolas"/>
+          <w:sz w:val="18"/>
+        </w:rPr>
+        <w:t xml:space="preserve">    rca4 stage2 (.a(x2), .b(y2), .cin(neg), .s(units), .cout(c2_unused));</w:t>
+        <w:br/>
+      </w:r>
+      <w:r>
+        <w:rPr>
+          <w:rFonts w:ascii="Consolas" w:hAnsi="Consolas"/>
+          <w:sz w:val="18"/>
+        </w:rPr>
+        <w:br/>
+      </w:r>
+      <w:r>
+        <w:rPr>
+          <w:rFonts w:ascii="Consolas" w:hAnsi="Consolas"/>
+          <w:sz w:val="18"/>
+        </w:rPr>
+        <w:t xml:space="preserve">    assign tens = add_fix;</w:t>
+        <w:br/>
+      </w:r>
+      <w:r>
+        <w:rPr>
+          <w:rFonts w:ascii="Consolas" w:hAnsi="Consolas"/>
+          <w:sz w:val="18"/>
+        </w:rPr>
+        <w:t xml:space="preserve">    assign sign = neg;</w:t>
+        <w:br/>
+      </w:r>
+      <w:r>
+        <w:rPr>
+          <w:rFonts w:ascii="Consolas" w:hAnsi="Consolas"/>
+          <w:sz w:val="18"/>
+        </w:rPr>
+        <w:t>endmodule</w:t>
+      </w:r>
+    </w:p>
+    <w:p>
+      <w:pPr>
+        <w:spacing w:after="40"/>
+      </w:pPr>
+      <w:r>
+        <w:t>Listing 3: bcd_to_xs3 and top module bcd_alu_xs3.</w:t>
+      </w:r>
+    </w:p>
+    <w:p>
+      <w:pPr>
         <w:pBdr>
           <w:top w:val="single" w:sz="4" w:space="4" w:color="A6A6A6"/>
           <w:left w:val="single" w:sz="4" w:space="4" w:color="A6A6A6"/>
           <w:bottom w:val="single" w:sz="4" w:space="4" w:color="A6A6A6"/>
           <w:right w:val="single" w:sz="4" w:space="4" w:color="A6A6A6"/>
         </w:pBdr>
-      </w:pPr>
-      <w:r>
-        <w:rPr>
-          <w:rFonts w:ascii="Consolas" w:hAnsi="Consolas"/>
-          <w:sz w:val="18"/>
-        </w:rPr>
-        <w:t>// BCD to Excess-3 code converter (gate-level, from K-map minimisation)</w:t>
-        <w:br/>
-      </w:r>
-      <w:r>
-        <w:rPr>
-          <w:rFonts w:ascii="Consolas" w:hAnsi="Consolas"/>
-          <w:sz w:val="18"/>
-        </w:rPr>
-        <w:t>// Inputs 1010-1111 are don't-cares.</w:t>
-        <w:br/>
-      </w:r>
-      <w:r>
-        <w:rPr>
-          <w:rFonts w:ascii="Consolas" w:hAnsi="Consolas"/>
-          <w:sz w:val="18"/>
-        </w:rPr>
-        <w:t>module bcd_to_xs3 (</w:t>
-        <w:br/>
-      </w:r>
-      <w:r>
-        <w:rPr>
-          <w:rFonts w:ascii="Consolas" w:hAnsi="Consolas"/>
-          <w:sz w:val="18"/>
-        </w:rPr>
-        <w:t xml:space="preserve">    input  wire [3:0] bcd,</w:t>
-        <w:br/>
-      </w:r>
-      <w:r>
-        <w:rPr>
-          <w:rFonts w:ascii="Consolas" w:hAnsi="Consolas"/>
-          <w:sz w:val="18"/>
-        </w:rPr>
-        <w:t xml:space="preserve">    output wire [3:0] xs3</w:t>
-        <w:br/>
-      </w:r>
-      <w:r>
-        <w:rPr>
-          <w:rFonts w:ascii="Consolas" w:hAnsi="Consolas"/>
-          <w:sz w:val="18"/>
-        </w:rPr>
-        <w:t>);</w:t>
-        <w:br/>
-      </w:r>
-      <w:r>
-        <w:rPr>
-          <w:rFonts w:ascii="Consolas" w:hAnsi="Consolas"/>
-          <w:sz w:val="18"/>
-        </w:rPr>
-        <w:t xml:space="preserve">    assign xs3[3] = bcd[3] | (bcd[2] &amp; (bcd[1] | bcd[0]));</w:t>
-        <w:br/>
-      </w:r>
-      <w:r>
-        <w:rPr>
-          <w:rFonts w:ascii="Consolas" w:hAnsi="Consolas"/>
-          <w:sz w:val="18"/>
-        </w:rPr>
-        <w:t xml:space="preserve">    assign xs3[2] = bcd[2] ^ (bcd[1] | bcd[0]);</w:t>
-        <w:br/>
-      </w:r>
-      <w:r>
-        <w:rPr>
-          <w:rFonts w:ascii="Consolas" w:hAnsi="Consolas"/>
-          <w:sz w:val="18"/>
-        </w:rPr>
-        <w:t xml:space="preserve">    assign xs3[1] = ~(bcd[1] ^ bcd[0]);</w:t>
-        <w:br/>
-      </w:r>
-      <w:r>
-        <w:rPr>
-          <w:rFonts w:ascii="Consolas" w:hAnsi="Consolas"/>
-          <w:sz w:val="18"/>
-        </w:rPr>
-        <w:t xml:space="preserve">    assign xs3[0] = ~bcd[0];</w:t>
-        <w:br/>
-      </w:r>
-      <w:r>
-        <w:rPr>
-          <w:rFonts w:ascii="Consolas" w:hAnsi="Consolas"/>
-          <w:sz w:val="18"/>
-        </w:rPr>
-        <w:t>endmodule</w:t>
-        <w:br/>
-      </w:r>
-      <w:r>
-        <w:rPr>
-          <w:rFonts w:ascii="Consolas" w:hAnsi="Consolas"/>
-          <w:sz w:val="18"/>
-        </w:rPr>
-        <w:br/>
-      </w:r>
-      <w:r>
-        <w:rPr>
-          <w:rFonts w:ascii="Consolas" w:hAnsi="Consolas"/>
-          <w:sz w:val="18"/>
-        </w:rPr>
-        <w:t>// Top module: BCD arithmetic unit with Excess-3 output</w:t>
-        <w:br/>
-      </w:r>
-      <w:r>
-        <w:rPr>
-          <w:rFonts w:ascii="Consolas" w:hAnsi="Consolas"/>
-          <w:sz w:val="18"/>
-        </w:rPr>
-        <w:t>module bcd_alu_xs3 (</w:t>
-        <w:br/>
-      </w:r>
-      <w:r>
-        <w:rPr>
-          <w:rFonts w:ascii="Consolas" w:hAnsi="Consolas"/>
-          <w:sz w:val="18"/>
-        </w:rPr>
-        <w:t xml:space="preserve">    input  wire [3:0] a,</w:t>
-        <w:br/>
-      </w:r>
-      <w:r>
-        <w:rPr>
-          <w:rFonts w:ascii="Consolas" w:hAnsi="Consolas"/>
-          <w:sz w:val="18"/>
-        </w:rPr>
-        <w:t xml:space="preserve">    input  wire [3:0] b,</w:t>
-        <w:br/>
-      </w:r>
-      <w:r>
-        <w:rPr>
-          <w:rFonts w:ascii="Consolas" w:hAnsi="Consolas"/>
-          <w:sz w:val="18"/>
-        </w:rPr>
-        <w:t xml:space="preserve">    input  wire       m,          // 0 = add, 1 = subtract</w:t>
-        <w:br/>
-      </w:r>
-      <w:r>
-        <w:rPr>
-          <w:rFonts w:ascii="Consolas" w:hAnsi="Consolas"/>
-          <w:sz w:val="18"/>
-        </w:rPr>
-        <w:t xml:space="preserve">    output wire [3:0] tens_bcd,</w:t>
-        <w:br/>
-      </w:r>
-      <w:r>
-        <w:rPr>
-          <w:rFonts w:ascii="Consolas" w:hAnsi="Consolas"/>
-          <w:sz w:val="18"/>
-        </w:rPr>
-        <w:t xml:space="preserve">    output wire [3:0] units_bcd,</w:t>
-        <w:br/>
-      </w:r>
-      <w:r>
-        <w:rPr>
-          <w:rFonts w:ascii="Consolas" w:hAnsi="Consolas"/>
-          <w:sz w:val="18"/>
-        </w:rPr>
-        <w:t xml:space="preserve">    output wire       sign,</w:t>
-        <w:br/>
-      </w:r>
-      <w:r>
-        <w:rPr>
-          <w:rFonts w:ascii="Consolas" w:hAnsi="Consolas"/>
-          <w:sz w:val="18"/>
-        </w:rPr>
-        <w:t xml:space="preserve">    output wire [3:0] tens_xs3,</w:t>
-        <w:br/>
-      </w:r>
-      <w:r>
-        <w:rPr>
-          <w:rFonts w:ascii="Consolas" w:hAnsi="Consolas"/>
-          <w:sz w:val="18"/>
-        </w:rPr>
-        <w:t xml:space="preserve">    output wire [3:0] units_xs3,</w:t>
-        <w:br/>
-      </w:r>
-      <w:r>
-        <w:rPr>
-          <w:rFonts w:ascii="Consolas" w:hAnsi="Consolas"/>
-          <w:sz w:val="18"/>
-        </w:rPr>
-        <w:t xml:space="preserve">    output wire       err         // high when either input is not a valid BCD digit</w:t>
-        <w:br/>
-      </w:r>
-      <w:r>
-        <w:rPr>
-          <w:rFonts w:ascii="Consolas" w:hAnsi="Consolas"/>
-          <w:sz w:val="18"/>
-        </w:rPr>
-        <w:t>);</w:t>
-        <w:br/>
-      </w:r>
-      <w:r>
-        <w:rPr>
-          <w:rFonts w:ascii="Consolas" w:hAnsi="Consolas"/>
-          <w:sz w:val="18"/>
-        </w:rPr>
-        <w:t xml:space="preserve">    wire       tens, sign_r;</w:t>
-        <w:br/>
-      </w:r>
-      <w:r>
-        <w:rPr>
-          <w:rFonts w:ascii="Consolas" w:hAnsi="Consolas"/>
-          <w:sz w:val="18"/>
-        </w:rPr>
-        <w:t xml:space="preserve">    wire [3:0] units_r, tens_r, tens_x, units_x;</w:t>
-        <w:br/>
-      </w:r>
-      <w:r>
-        <w:rPr>
-          <w:rFonts w:ascii="Consolas" w:hAnsi="Consolas"/>
-          <w:sz w:val="18"/>
-        </w:rPr>
-        <w:br/>
-      </w:r>
-      <w:r>
-        <w:rPr>
-          <w:rFonts w:ascii="Consolas" w:hAnsi="Consolas"/>
-          <w:sz w:val="18"/>
-        </w:rPr>
-        <w:t xml:space="preserve">    bcd_addsub u_arith (.a(a), .b(b), .m(m), .units(units_r), .tens(tens), .sign(sign_r));</w:t>
-        <w:br/>
-      </w:r>
-      <w:r>
-        <w:rPr>
-          <w:rFonts w:ascii="Consolas" w:hAnsi="Consolas"/>
-          <w:sz w:val="18"/>
-        </w:rPr>
-        <w:br/>
-      </w:r>
-      <w:r>
-        <w:rPr>
-          <w:rFonts w:ascii="Consolas" w:hAnsi="Consolas"/>
-          <w:sz w:val="18"/>
-        </w:rPr>
-        <w:t xml:space="preserve">    assign tens_r = {3'b000, tens};</w:t>
-        <w:br/>
-      </w:r>
-      <w:r>
-        <w:rPr>
-          <w:rFonts w:ascii="Consolas" w:hAnsi="Consolas"/>
-          <w:sz w:val="18"/>
-        </w:rPr>
-        <w:br/>
-      </w:r>
-      <w:r>
-        <w:rPr>
-          <w:rFonts w:ascii="Consolas" w:hAnsi="Consolas"/>
-          <w:sz w:val="18"/>
-        </w:rPr>
-        <w:t xml:space="preserve">    bcd_to_xs3 u_xs3_t (.bcd(tens_r),  .xs3(tens_x));</w:t>
-        <w:br/>
-      </w:r>
-      <w:r>
-        <w:rPr>
-          <w:rFonts w:ascii="Consolas" w:hAnsi="Consolas"/>
-          <w:sz w:val="18"/>
-        </w:rPr>
-        <w:t xml:space="preserve">    bcd_to_xs3 u_xs3_u (.bcd(units_r), .xs3(units_x));</w:t>
-        <w:br/>
-      </w:r>
-      <w:r>
-        <w:rPr>
-          <w:rFonts w:ascii="Consolas" w:hAnsi="Consolas"/>
-          <w:sz w:val="18"/>
-        </w:rPr>
-        <w:br/>
-      </w:r>
-      <w:r>
-        <w:rPr>
-          <w:rFonts w:ascii="Consolas" w:hAnsi="Consolas"/>
-          <w:sz w:val="18"/>
-        </w:rPr>
-        <w:t xml:space="preserve">    // Input validity: 1010-1111 are not BCD digits</w:t>
-        <w:br/>
-      </w:r>
-      <w:r>
-        <w:rPr>
-          <w:rFonts w:ascii="Consolas" w:hAnsi="Consolas"/>
-          <w:sz w:val="18"/>
-        </w:rPr>
-        <w:t xml:space="preserve">    assign err = (a[3] &amp; (a[2] | a[1])) | (b[3] &amp; (b[2] | b[1]));</w:t>
-        <w:br/>
-      </w:r>
-      <w:r>
-        <w:rPr>
-          <w:rFonts w:ascii="Consolas" w:hAnsi="Consolas"/>
-          <w:sz w:val="18"/>
-        </w:rPr>
-        <w:br/>
-      </w:r>
-      <w:r>
-        <w:rPr>
-          <w:rFonts w:ascii="Consolas" w:hAnsi="Consolas"/>
-          <w:sz w:val="18"/>
-        </w:rPr>
-        <w:t xml:space="preserve">    // Output mask: every data output is forced to 0 for an invalid input</w:t>
-        <w:br/>
-      </w:r>
-      <w:r>
-        <w:rPr>
-          <w:rFonts w:ascii="Consolas" w:hAnsi="Consolas"/>
-          <w:sz w:val="18"/>
-        </w:rPr>
-        <w:t xml:space="preserve">    wire ok = ~err;</w:t>
-        <w:br/>
-      </w:r>
-      <w:r>
-        <w:rPr>
-          <w:rFonts w:ascii="Consolas" w:hAnsi="Consolas"/>
-          <w:sz w:val="18"/>
-        </w:rPr>
-        <w:t xml:space="preserve">    assign tens_bcd  = tens_r  &amp; {4{ok}};</w:t>
-        <w:br/>
-      </w:r>
-      <w:r>
-        <w:rPr>
-          <w:rFonts w:ascii="Consolas" w:hAnsi="Consolas"/>
-          <w:sz w:val="18"/>
-        </w:rPr>
-        <w:t xml:space="preserve">    assign units_bcd = units_r &amp; {4{ok}};</w:t>
-        <w:br/>
-      </w:r>
-      <w:r>
-        <w:rPr>
-          <w:rFonts w:ascii="Consolas" w:hAnsi="Consolas"/>
-          <w:sz w:val="18"/>
-        </w:rPr>
-        <w:t xml:space="preserve">    assign sign      = sign_r  &amp; ok;</w:t>
-        <w:br/>
-      </w:r>
-      <w:r>
-        <w:rPr>
-          <w:rFonts w:ascii="Consolas" w:hAnsi="Consolas"/>
-          <w:sz w:val="18"/>
-        </w:rPr>
-        <w:t xml:space="preserve">    assign tens_xs3  = tens_x  &amp; {4{ok}};</w:t>
-        <w:br/>
-      </w:r>
-      <w:r>
-        <w:rPr>
-          <w:rFonts w:ascii="Consolas" w:hAnsi="Consolas"/>
-          <w:sz w:val="18"/>
-        </w:rPr>
-        <w:t xml:space="preserve">    assign units_xs3 = units_x &amp; {4{ok}};</w:t>
-        <w:br/>
-      </w:r>
-      <w:r>
-        <w:rPr>
-          <w:rFonts w:ascii="Consolas" w:hAnsi="Consolas"/>
-          <w:sz w:val="18"/>
-        </w:rPr>
-        <w:t>endmodule</w:t>
-      </w:r>
-    </w:p>
-    <w:p>
-      <w:pPr>
-        <w:pStyle w:val="Heading2"/>
-      </w:pPr>
-      <w:r>
-        <w:t>4.2 Code explanation</w:t>
-      </w:r>
-    </w:p>
-    <w:p>
-      <w:pPr>
-        <w:pStyle w:val="ListBullet"/>
-      </w:pPr>
-      <w:r>
-        <w:rPr>
-          <w:b/>
-        </w:rPr>
-        <w:t xml:space="preserve">full_adder / rca4: </w:t>
-      </w:r>
-      <w:r>
-        <w:t>The full adder implements the standard sum and carry equations. rca4 chains four instances through internal carries c1–c3.</w:t>
-      </w:r>
-    </w:p>
-    <w:p>
-      <w:pPr>
-        <w:pStyle w:val="ListBullet"/>
-      </w:pPr>
-      <w:r>
-        <w:rPr>
-          <w:b/>
-        </w:rPr>
-        <w:t xml:space="preserve">Stage 1 (bcd_addsub): </w:t>
-      </w:r>
-      <w:r>
-        <w:t>b_x = b ^ {4{m}} replicates M across four bits to invert B only in subtract mode, and cin = m supplies the +1 of the two’s complement. One adder therefore serves both operations.</w:t>
-      </w:r>
-    </w:p>
-    <w:p>
-      <w:pPr>
-        <w:pStyle w:val="ListBullet"/>
-      </w:pPr>
-      <w:r>
-        <w:rPr>
-          <w:b/>
-        </w:rPr>
-        <w:t xml:space="preserve">Correction signals: </w:t>
-      </w:r>
-      <w:r>
-        <w:t>k implements Eq. (1). add_fix = ~m &amp; k restricts the +0110 correction to addition, and neg = m &amp; ~c1 detects a negative difference.</w:t>
-      </w:r>
-    </w:p>
-    <w:p>
-      <w:pPr>
-        <w:pStyle w:val="ListBullet"/>
-      </w:pPr>
-      <w:r>
-        <w:rPr>
-          <w:b/>
-        </w:rPr>
-        <w:t xml:space="preserve">Stage 2: </w:t>
-      </w:r>
-      <w:r>
-        <w:t>x2 = s1 ^ {4{neg}} inverts S1 only for a negative difference, and cin = neg adds 1, giving S1′ + 1. y2 = {0, add_fix, add_fix, 0} equals 0110 only when the decimal correction is needed. In every other case Stage 2 passes S1 through unchanged. Stage 2’s carry-out is not used: for valid inputs, the decimal carry is already captured by add_fix.</w:t>
-      </w:r>
-    </w:p>
-    <w:p>
-      <w:pPr>
-        <w:pStyle w:val="ListBullet"/>
-      </w:pPr>
-      <w:r>
-        <w:rPr>
-          <w:b/>
-        </w:rPr>
-        <w:t xml:space="preserve">Outputs: </w:t>
-      </w:r>
-      <w:r>
-        <w:t>tens = add_fix and sign = neg. The top module widens tens to a 4-bit BCD digit (000T) so that both digits can use the same bcd_to_xs3 module.</w:t>
-      </w:r>
-    </w:p>
-    <w:p>
-      <w:pPr>
-        <w:pStyle w:val="ListBullet"/>
-      </w:pPr>
-      <w:r>
-        <w:rPr>
-          <w:b/>
-        </w:rPr>
-        <w:t xml:space="preserve">Validity check: </w:t>
-      </w:r>
-      <w:r>
-        <w:t>a[3] &amp; (a[2] | a[1]) is true exactly for 1010–1111, i.e., values above 9. The same test on B is ORed into err.</w:t>
-      </w:r>
-    </w:p>
-    <w:p>
-      <w:pPr>
-        <w:pStyle w:val="ListBullet"/>
-      </w:pPr>
-      <w:r>
-        <w:rPr>
-          <w:b/>
-        </w:rPr>
-        <w:t xml:space="preserve">Output mask: </w:t>
-      </w:r>
-      <w:r>
-        <w:t>ok = ~err is replicated across each bus and ANDed with it, so an invalid input gives 0 on every data output instead of a meaningless value. The masked Excess-3 output 0000 is not a valid Excess-3 code, so the result cannot be mistaken for a real digit.</w:t>
-      </w:r>
-    </w:p>
-    <w:p>
-      <w:pPr>
-        <w:pStyle w:val="Heading2"/>
-      </w:pPr>
-      <w:r>
-        <w:t>4.3 Testbench</w:t>
-      </w:r>
-    </w:p>
-    <w:p>
-      <w:r>
-        <w:t>The testbench tb_bcd_alu_xs3 is self-checking. A task named check computes the expected result behaviourally, using integer arithmetic and the operators / and %. The Excess-3 outputs are expected to be the digit + 3, and for an invalid input every data output is expected to be 0. All six DUT outputs are compared in one step with the case-inequality operator !==, so an unknown (X) or floating (Z) bit also counts as a failure. No clock is needed; each stimulus is held for 10 ns. The testbench first applies ten directed cases (T1–T10 in Table VI), then sweeps all 512 combinations of A, B (0–15) and M. Its essential part is:</w:t>
-      </w:r>
-    </w:p>
-    <w:p>
-      <w:pPr>
         <w:spacing w:after="120" w:line="240" w:lineRule="auto"/>
         <w:ind w:left="170" w:right="170"/>
         <w:jc w:val="left"/>
+      </w:pPr>
+      <w:r>
+        <w:rPr>
+          <w:rFonts w:ascii="Consolas" w:hAnsi="Consolas"/>
+          <w:sz w:val="18"/>
+        </w:rPr>
+        <w:t>// BCD to Excess-3 code converter (gate-level, from K-map minimisation)</w:t>
+        <w:br/>
+      </w:r>
+      <w:r>
+        <w:rPr>
+          <w:rFonts w:ascii="Consolas" w:hAnsi="Consolas"/>
+          <w:sz w:val="18"/>
+        </w:rPr>
+        <w:t>// Inputs 1010-1111 are don't-cares.</w:t>
+        <w:br/>
+      </w:r>
+      <w:r>
+        <w:rPr>
+          <w:rFonts w:ascii="Consolas" w:hAnsi="Consolas"/>
+          <w:sz w:val="18"/>
+        </w:rPr>
+        <w:t>module bcd_to_xs3 (</w:t>
+        <w:br/>
+      </w:r>
+      <w:r>
+        <w:rPr>
+          <w:rFonts w:ascii="Consolas" w:hAnsi="Consolas"/>
+          <w:sz w:val="18"/>
+        </w:rPr>
+        <w:t xml:space="preserve">    input  wire [3:0] bcd,</w:t>
+        <w:br/>
+      </w:r>
+      <w:r>
+        <w:rPr>
+          <w:rFonts w:ascii="Consolas" w:hAnsi="Consolas"/>
+          <w:sz w:val="18"/>
+        </w:rPr>
+        <w:t xml:space="preserve">    output wire [3:0] xs3</w:t>
+        <w:br/>
+      </w:r>
+      <w:r>
+        <w:rPr>
+          <w:rFonts w:ascii="Consolas" w:hAnsi="Consolas"/>
+          <w:sz w:val="18"/>
+        </w:rPr>
+        <w:t>);</w:t>
+        <w:br/>
+      </w:r>
+      <w:r>
+        <w:rPr>
+          <w:rFonts w:ascii="Consolas" w:hAnsi="Consolas"/>
+          <w:sz w:val="18"/>
+        </w:rPr>
+        <w:t xml:space="preserve">    assign xs3[3] = bcd[3] | (bcd[2] &amp; (bcd[1] | bcd[0]));</w:t>
+        <w:br/>
+      </w:r>
+      <w:r>
+        <w:rPr>
+          <w:rFonts w:ascii="Consolas" w:hAnsi="Consolas"/>
+          <w:sz w:val="18"/>
+        </w:rPr>
+        <w:t xml:space="preserve">    assign xs3[2] = bcd[2] ^ (bcd[1] | bcd[0]);</w:t>
+        <w:br/>
+      </w:r>
+      <w:r>
+        <w:rPr>
+          <w:rFonts w:ascii="Consolas" w:hAnsi="Consolas"/>
+          <w:sz w:val="18"/>
+        </w:rPr>
+        <w:t xml:space="preserve">    assign xs3[1] = ~(bcd[1] ^ bcd[0]);</w:t>
+        <w:br/>
+      </w:r>
+      <w:r>
+        <w:rPr>
+          <w:rFonts w:ascii="Consolas" w:hAnsi="Consolas"/>
+          <w:sz w:val="18"/>
+        </w:rPr>
+        <w:t xml:space="preserve">    assign xs3[0] = ~bcd[0];</w:t>
+        <w:br/>
+      </w:r>
+      <w:r>
+        <w:rPr>
+          <w:rFonts w:ascii="Consolas" w:hAnsi="Consolas"/>
+          <w:sz w:val="18"/>
+        </w:rPr>
+        <w:t>endmodule</w:t>
+        <w:br/>
+      </w:r>
+      <w:r>
+        <w:rPr>
+          <w:rFonts w:ascii="Consolas" w:hAnsi="Consolas"/>
+          <w:sz w:val="18"/>
+        </w:rPr>
+        <w:br/>
+      </w:r>
+      <w:r>
+        <w:rPr>
+          <w:rFonts w:ascii="Consolas" w:hAnsi="Consolas"/>
+          <w:sz w:val="18"/>
+        </w:rPr>
+        <w:t>// Top module: BCD arithmetic unit with Excess-3 output</w:t>
+        <w:br/>
+      </w:r>
+      <w:r>
+        <w:rPr>
+          <w:rFonts w:ascii="Consolas" w:hAnsi="Consolas"/>
+          <w:sz w:val="18"/>
+        </w:rPr>
+        <w:t>module bcd_alu_xs3 (</w:t>
+        <w:br/>
+      </w:r>
+      <w:r>
+        <w:rPr>
+          <w:rFonts w:ascii="Consolas" w:hAnsi="Consolas"/>
+          <w:sz w:val="18"/>
+        </w:rPr>
+        <w:t xml:space="preserve">    input  wire [3:0] a,</w:t>
+        <w:br/>
+      </w:r>
+      <w:r>
+        <w:rPr>
+          <w:rFonts w:ascii="Consolas" w:hAnsi="Consolas"/>
+          <w:sz w:val="18"/>
+        </w:rPr>
+        <w:t xml:space="preserve">    input  wire [3:0] b,</w:t>
+        <w:br/>
+      </w:r>
+      <w:r>
+        <w:rPr>
+          <w:rFonts w:ascii="Consolas" w:hAnsi="Consolas"/>
+          <w:sz w:val="18"/>
+        </w:rPr>
+        <w:t xml:space="preserve">    input  wire       m,          // 0 = add, 1 = subtract</w:t>
+        <w:br/>
+      </w:r>
+      <w:r>
+        <w:rPr>
+          <w:rFonts w:ascii="Consolas" w:hAnsi="Consolas"/>
+          <w:sz w:val="18"/>
+        </w:rPr>
+        <w:t xml:space="preserve">    output wire [3:0] tens_bcd,</w:t>
+        <w:br/>
+      </w:r>
+      <w:r>
+        <w:rPr>
+          <w:rFonts w:ascii="Consolas" w:hAnsi="Consolas"/>
+          <w:sz w:val="18"/>
+        </w:rPr>
+        <w:t xml:space="preserve">    output wire [3:0] units_bcd,</w:t>
+        <w:br/>
+      </w:r>
+      <w:r>
+        <w:rPr>
+          <w:rFonts w:ascii="Consolas" w:hAnsi="Consolas"/>
+          <w:sz w:val="18"/>
+        </w:rPr>
+        <w:t xml:space="preserve">    output wire       sign,</w:t>
+        <w:br/>
+      </w:r>
+      <w:r>
+        <w:rPr>
+          <w:rFonts w:ascii="Consolas" w:hAnsi="Consolas"/>
+          <w:sz w:val="18"/>
+        </w:rPr>
+        <w:t xml:space="preserve">    output wire [3:0] tens_xs3,</w:t>
+        <w:br/>
+      </w:r>
+      <w:r>
+        <w:rPr>
+          <w:rFonts w:ascii="Consolas" w:hAnsi="Consolas"/>
+          <w:sz w:val="18"/>
+        </w:rPr>
+        <w:t xml:space="preserve">    output wire [3:0] units_xs3,</w:t>
+        <w:br/>
+      </w:r>
+      <w:r>
+        <w:rPr>
+          <w:rFonts w:ascii="Consolas" w:hAnsi="Consolas"/>
+          <w:sz w:val="18"/>
+        </w:rPr>
+        <w:t xml:space="preserve">    output wire       err         // high when either input is not a valid BCD digit</w:t>
+        <w:br/>
+      </w:r>
+      <w:r>
+        <w:rPr>
+          <w:rFonts w:ascii="Consolas" w:hAnsi="Consolas"/>
+          <w:sz w:val="18"/>
+        </w:rPr>
+        <w:t>);</w:t>
+        <w:br/>
+      </w:r>
+      <w:r>
+        <w:rPr>
+          <w:rFonts w:ascii="Consolas" w:hAnsi="Consolas"/>
+          <w:sz w:val="18"/>
+        </w:rPr>
+        <w:t xml:space="preserve">    wire       tens, sign_r;</w:t>
+        <w:br/>
+      </w:r>
+      <w:r>
+        <w:rPr>
+          <w:rFonts w:ascii="Consolas" w:hAnsi="Consolas"/>
+          <w:sz w:val="18"/>
+        </w:rPr>
+        <w:t xml:space="preserve">    wire [3:0] units_r, tens_r, tens_x, units_x;</w:t>
+        <w:br/>
+      </w:r>
+      <w:r>
+        <w:rPr>
+          <w:rFonts w:ascii="Consolas" w:hAnsi="Consolas"/>
+          <w:sz w:val="18"/>
+        </w:rPr>
+        <w:br/>
+      </w:r>
+      <w:r>
+        <w:rPr>
+          <w:rFonts w:ascii="Consolas" w:hAnsi="Consolas"/>
+          <w:sz w:val="18"/>
+        </w:rPr>
+        <w:t xml:space="preserve">    bcd_addsub u_arith (.a(a), .b(b), .m(m), .units(units_r), .tens(tens), .sign(sign_r));</w:t>
+        <w:br/>
+      </w:r>
+      <w:r>
+        <w:rPr>
+          <w:rFonts w:ascii="Consolas" w:hAnsi="Consolas"/>
+          <w:sz w:val="18"/>
+        </w:rPr>
+        <w:br/>
+      </w:r>
+      <w:r>
+        <w:rPr>
+          <w:rFonts w:ascii="Consolas" w:hAnsi="Consolas"/>
+          <w:sz w:val="18"/>
+        </w:rPr>
+        <w:t xml:space="preserve">    assign tens_r = {3'b000, tens};</w:t>
+        <w:br/>
+      </w:r>
+      <w:r>
+        <w:rPr>
+          <w:rFonts w:ascii="Consolas" w:hAnsi="Consolas"/>
+          <w:sz w:val="18"/>
+        </w:rPr>
+        <w:br/>
+      </w:r>
+      <w:r>
+        <w:rPr>
+          <w:rFonts w:ascii="Consolas" w:hAnsi="Consolas"/>
+          <w:sz w:val="18"/>
+        </w:rPr>
+        <w:t xml:space="preserve">    bcd_to_xs3 u_xs3_t (.bcd(tens_r),  .xs3(tens_x));</w:t>
+        <w:br/>
+      </w:r>
+      <w:r>
+        <w:rPr>
+          <w:rFonts w:ascii="Consolas" w:hAnsi="Consolas"/>
+          <w:sz w:val="18"/>
+        </w:rPr>
+        <w:t xml:space="preserve">    bcd_to_xs3 u_xs3_u (.bcd(units_r), .xs3(units_x));</w:t>
+        <w:br/>
+      </w:r>
+      <w:r>
+        <w:rPr>
+          <w:rFonts w:ascii="Consolas" w:hAnsi="Consolas"/>
+          <w:sz w:val="18"/>
+        </w:rPr>
+        <w:br/>
+      </w:r>
+      <w:r>
+        <w:rPr>
+          <w:rFonts w:ascii="Consolas" w:hAnsi="Consolas"/>
+          <w:sz w:val="18"/>
+        </w:rPr>
+        <w:t xml:space="preserve">    // Input validity: 1010-1111 are not BCD digits</w:t>
+        <w:br/>
+      </w:r>
+      <w:r>
+        <w:rPr>
+          <w:rFonts w:ascii="Consolas" w:hAnsi="Consolas"/>
+          <w:sz w:val="18"/>
+        </w:rPr>
+        <w:t xml:space="preserve">    assign err = (a[3] &amp; (a[2] | a[1])) | (b[3] &amp; (b[2] | b[1]));</w:t>
+        <w:br/>
+      </w:r>
+      <w:r>
+        <w:rPr>
+          <w:rFonts w:ascii="Consolas" w:hAnsi="Consolas"/>
+          <w:sz w:val="18"/>
+        </w:rPr>
+        <w:br/>
+      </w:r>
+      <w:r>
+        <w:rPr>
+          <w:rFonts w:ascii="Consolas" w:hAnsi="Consolas"/>
+          <w:sz w:val="18"/>
+        </w:rPr>
+        <w:t xml:space="preserve">    // Output mask: every data output is forced to 0 for an invalid input</w:t>
+        <w:br/>
+      </w:r>
+      <w:r>
+        <w:rPr>
+          <w:rFonts w:ascii="Consolas" w:hAnsi="Consolas"/>
+          <w:sz w:val="18"/>
+        </w:rPr>
+        <w:t xml:space="preserve">    wire ok = ~err;</w:t>
+        <w:br/>
+      </w:r>
+      <w:r>
+        <w:rPr>
+          <w:rFonts w:ascii="Consolas" w:hAnsi="Consolas"/>
+          <w:sz w:val="18"/>
+        </w:rPr>
+        <w:t xml:space="preserve">    assign tens_bcd  = tens_r  &amp; {4{ok}};</w:t>
+        <w:br/>
+      </w:r>
+      <w:r>
+        <w:rPr>
+          <w:rFonts w:ascii="Consolas" w:hAnsi="Consolas"/>
+          <w:sz w:val="18"/>
+        </w:rPr>
+        <w:t xml:space="preserve">    assign units_bcd = units_r &amp; {4{ok}};</w:t>
+        <w:br/>
+      </w:r>
+      <w:r>
+        <w:rPr>
+          <w:rFonts w:ascii="Consolas" w:hAnsi="Consolas"/>
+          <w:sz w:val="18"/>
+        </w:rPr>
+        <w:t xml:space="preserve">    assign sign      = sign_r  &amp; ok;</w:t>
+        <w:br/>
+      </w:r>
+      <w:r>
+        <w:rPr>
+          <w:rFonts w:ascii="Consolas" w:hAnsi="Consolas"/>
+          <w:sz w:val="18"/>
+        </w:rPr>
+        <w:t xml:space="preserve">    assign tens_xs3  = tens_x  &amp; {4{ok}};</w:t>
+        <w:br/>
+      </w:r>
+      <w:r>
+        <w:rPr>
+          <w:rFonts w:ascii="Consolas" w:hAnsi="Consolas"/>
+          <w:sz w:val="18"/>
+        </w:rPr>
+        <w:t xml:space="preserve">    assign units_xs3 = units_x &amp; {4{ok}};</w:t>
+        <w:br/>
+      </w:r>
+      <w:r>
+        <w:rPr>
+          <w:rFonts w:ascii="Consolas" w:hAnsi="Consolas"/>
+          <w:sz w:val="18"/>
+        </w:rPr>
+        <w:t>endmodule</w:t>
+      </w:r>
+    </w:p>
+    <w:p>
+      <w:pPr>
+        <w:pStyle w:val="Heading2"/>
+      </w:pPr>
+      <w:r>
+        <w:t>4.2 Code explanation</w:t>
+      </w:r>
+    </w:p>
+    <w:p>
+      <w:pPr>
+        <w:pStyle w:val="ListBullet"/>
+      </w:pPr>
+      <w:r>
+        <w:rPr>
+          <w:b/>
+        </w:rPr>
+        <w:t xml:space="preserve">full_adder / rca4: </w:t>
+      </w:r>
+      <w:r>
+        <w:t>The full adder implements the standard sum and carry equations. rca4 chains four instances through internal carries c1–c3.</w:t>
+      </w:r>
+    </w:p>
+    <w:p>
+      <w:pPr>
+        <w:pStyle w:val="ListBullet"/>
+      </w:pPr>
+      <w:r>
+        <w:rPr>
+          <w:b/>
+        </w:rPr>
+        <w:t xml:space="preserve">Stage 1 (bcd_addsub): </w:t>
+      </w:r>
+      <w:r>
+        <w:t>b_x = b ^ {4{m}} replicates M across four bits to invert B only in subtract mode, and cin = m supplies the +1 of the two’s complement. One adder therefore serves both operations.</w:t>
+      </w:r>
+    </w:p>
+    <w:p>
+      <w:pPr>
+        <w:pStyle w:val="ListBullet"/>
+      </w:pPr>
+      <w:r>
+        <w:rPr>
+          <w:b/>
+        </w:rPr>
+        <w:t xml:space="preserve">Correction signals: </w:t>
+      </w:r>
+      <w:r>
+        <w:t>k implements Eq. (1). add_fix = ~m &amp; k restricts the +0110 correction to addition, and neg = m &amp; ~c1 detects a negative difference.</w:t>
+      </w:r>
+    </w:p>
+    <w:p>
+      <w:pPr>
+        <w:pStyle w:val="ListBullet"/>
+      </w:pPr>
+      <w:r>
+        <w:rPr>
+          <w:b/>
+        </w:rPr>
+        <w:t xml:space="preserve">Stage 2: </w:t>
+      </w:r>
+      <w:r>
+        <w:t>x2 = s1 ^ {4{neg}} inverts S1 only for a negative difference, and cin = neg adds 1, giving S1′ + 1. y2 = {0, add_fix, add_fix, 0} equals 0110 only when the decimal correction is needed. In every other case Stage 2 passes S1 through unchanged. Stage 2’s carry-out is not used: for valid inputs, the decimal carry is already captured by add_fix.</w:t>
+      </w:r>
+    </w:p>
+    <w:p>
+      <w:pPr>
+        <w:pStyle w:val="ListBullet"/>
+      </w:pPr>
+      <w:r>
+        <w:rPr>
+          <w:b/>
+        </w:rPr>
+        <w:t xml:space="preserve">Outputs: </w:t>
+      </w:r>
+      <w:r>
+        <w:t>tens = add_fix and sign = neg. The top module widens tens to a 4-bit BCD digit (000T) so that both digits can use the same bcd_to_xs3 module.</w:t>
+      </w:r>
+    </w:p>
+    <w:p>
+      <w:pPr>
+        <w:pStyle w:val="ListBullet"/>
+      </w:pPr>
+      <w:r>
+        <w:rPr>
+          <w:b/>
+        </w:rPr>
+        <w:t xml:space="preserve">Validity check: </w:t>
+      </w:r>
+      <w:r>
+        <w:t>a[3] &amp; (a[2] | a[1]) is true exactly for 1010–1111, i.e., values above 9. The same test on B is ORed into err.</w:t>
+      </w:r>
+    </w:p>
+    <w:p>
+      <w:pPr>
+        <w:pStyle w:val="ListBullet"/>
+      </w:pPr>
+      <w:r>
+        <w:rPr>
+          <w:b/>
+        </w:rPr>
+        <w:t xml:space="preserve">Output mask: </w:t>
+      </w:r>
+      <w:r>
+        <w:t>ok = ~err is replicated across each bus and ANDed with it, so an invalid input gives 0 on every data output instead of a meaningless value. The masked Excess-3 output 0000 is not a valid Excess-3 code, so the result cannot be mistaken for a real digit.</w:t>
+      </w:r>
+    </w:p>
+    <w:p>
+      <w:pPr>
+        <w:pStyle w:val="Heading2"/>
+      </w:pPr>
+      <w:r>
+        <w:t>4.3 Testbench</w:t>
+      </w:r>
+    </w:p>
+    <w:p>
+      <w:r>
+        <w:t>The testbench tb_bcd_alu_xs3 is self-checking. A task named check computes the expected result behaviourally, using integer arithmetic and the operators / and %. The Excess-3 outputs are expected to be the digit + 3, and for an invalid input every data output is expected to be 0. All six DUT outputs are compared in one step with the case-inequality operator !==, so an unknown (X) or floating (Z) bit also counts as a failure. No clock is needed; each stimulus is held for 10 ns. The testbench first applies ten directed cases (T1–T10 in Table VI), then sweeps all 512 combinations of A, B (0–15) and M. Its essential part is:</w:t>
+      </w:r>
+    </w:p>
+    <w:p>
+      <w:pPr>
         <w:pBdr>
           <w:top w:val="single" w:sz="4" w:space="4" w:color="A6A6A6"/>
           <w:left w:val="single" w:sz="4" w:space="4" w:color="A6A6A6"/>
           <w:bottom w:val="single" w:sz="4" w:space="4" w:color="A6A6A6"/>
           <w:right w:val="single" w:sz="4" w:space="4" w:color="A6A6A6"/>
         </w:pBdr>
+        <w:spacing w:after="120" w:line="240" w:lineRule="auto"/>
+        <w:ind w:left="170" w:right="170"/>
+        <w:jc w:val="left"/>
       </w:pPr>
       <w:r>
         <w:rPr>
@@ -5815,7 +5815,7 @@
                 <w:b w:val="0"/>
                 <w:sz w:val="18"/>
               </w:rPr>
-              <w:t>Subtract path of bcd_addsub.v; Sections 1 and 2</w:t>
+              <w:t>Subtract path of bcd_addsub.v; Sections 1.1, 1.2 and 2</w:t>
             </w:r>
           </w:p>
         </w:tc>
@@ -6152,7 +6152,7 @@
         <w:rPr>
           <w:i w:val="0"/>
         </w:rPr>
-        <w:t>, 6th ed. Hoboken, NJ, USA: Pearson, 2018.</w:t>
+        <w:t>, 6th ed. New York, NY, USA: Pearson, 2018.</w:t>
       </w:r>
     </w:p>
     <w:p>

</xml_diff>